<commit_message>
Added 3d data structure
</commit_message>
<xml_diff>
--- a/Year 11 Computer Science Task One.docx
+++ b/Year 11 Computer Science Task One.docx
@@ -1680,42 +1680,6 @@
         </w:rPr>
         <w:t>modifier</w:t>
       </w:r>
-    </w:p>
-    <w:p>
-      <w:pPr>
-        <w:rPr>
-          <w:rFonts w:cs="Arial"/>
-          <w:bCs/>
-          <w:lang w:val="en-US"/>
-        </w:rPr>
-      </w:pPr>
-    </w:p>
-    <w:p>
-      <w:pPr>
-        <w:rPr>
-          <w:rFonts w:cs="Arial"/>
-          <w:bCs/>
-          <w:lang w:val="en-US"/>
-        </w:rPr>
-      </w:pPr>
-    </w:p>
-    <w:p>
-      <w:pPr>
-        <w:rPr>
-          <w:rFonts w:cs="Arial"/>
-          <w:bCs/>
-          <w:lang w:val="en-US"/>
-        </w:rPr>
-      </w:pPr>
-    </w:p>
-    <w:p>
-      <w:pPr>
-        <w:rPr>
-          <w:rFonts w:cs="Arial"/>
-          <w:bCs/>
-          <w:lang w:val="en-US"/>
-        </w:rPr>
-      </w:pPr>
     </w:p>
     <w:p>
       <w:pPr>

</xml_diff>

<commit_message>
Begin work on a simpler version.
</commit_message>
<xml_diff>
--- a/Year 11 Computer Science Task One.docx
+++ b/Year 11 Computer Science Task One.docx
@@ -1610,6 +1610,7 @@
           <w:lang w:val="en-US"/>
         </w:rPr>
       </w:pPr>
+      <w:proofErr w:type="spellStart"/>
       <w:r>
         <w:rPr>
           <w:rFonts w:cs="Arial"/>
@@ -1620,6 +1621,7 @@
         </w:rPr>
         <w:t>UserInput</w:t>
       </w:r>
+      <w:proofErr w:type="spellEnd"/>
     </w:p>
     <w:p>
       <w:pPr>
@@ -2081,7 +2083,23 @@
                                 <w:sz w:val="13"/>
                                 <w:szCs w:val="13"/>
                               </w:rPr>
-                              <w:t>Define main_loop which allows the program to return to its start page at any point.</w:t>
+                              <w:t xml:space="preserve">Define </w:t>
+                            </w:r>
+                            <w:proofErr w:type="spellStart"/>
+                            <w:r>
+                              <w:rPr>
+                                <w:sz w:val="13"/>
+                                <w:szCs w:val="13"/>
+                              </w:rPr>
+                              <w:t>main_loop</w:t>
+                            </w:r>
+                            <w:proofErr w:type="spellEnd"/>
+                            <w:r>
+                              <w:rPr>
+                                <w:sz w:val="13"/>
+                                <w:szCs w:val="13"/>
+                              </w:rPr>
+                              <w:t xml:space="preserve"> which allows the program to return to its start page at any point.</w:t>
                             </w:r>
                           </w:p>
                         </w:txbxContent>

</xml_diff>